<commit_message>
docs: synchronize all project documentation artifacts with Phase 2 delivery
- progress.md: Added Chunks 34 to 37 recording Phase 1 domain layer, Astra P0 hardening (ADR-001), Phase 2 design tokens, AnnouncementCoordinator, vertical slice rebuild, ticketing migration, Gate 12 safety, floating AI overlay a11y, and 236-test suite.
- Foundation Plan & Spec: Marked foundation tasks complete and added evolutionary architectural maturity record.
- Word Documents (.docx): Updated BusBuddy_Project_Handoff_Document_Updated.docx (Section 34 delivery confirmation & Section 35 ADRs) and BusBuddy_Project_Report_Updated.docx (Section 6.1 Phase 2 delivery).
- scripts: Added update_all_documentation_artifacts.py to deterministically maintain project report and handoff Word documents.
</commit_message>
<xml_diff>
--- a/BusBuddy_Project_Handoff_Document_Updated.docx
+++ b/BusBuddy_Project_Handoff_Document_Updated.docx
@@ -4905,12 +4905,250 @@
         <w:pStyle w:val="Heading1"/>
       </w:pPr>
       <w:r>
-        <w:t>34. Handoff Status</w:t>
+        <w:t>34. Handoff Status &amp; Phase 2 Delivery Confirmation</w:t>
       </w:r>
     </w:p>
     <w:p>
       <w:r>
-        <w:t>This document captures the project's updated agreed direction and planning decisions. BusBuddy is adaptive and accessibility-first, prioritizing visually impaired users and older adults while remaining useful to general commuters. Adaptive UI and user-created customization are in scope with explicit user control. Gemini Live is a grounded conversational control layer. Ticketing/payment and AI-assisted driver communication remain advanced/future concepts. Geographic scope is fixed to Vellore City, with VIT Vellore and nearby stops as primary prototype points. Production Flutter implementation is still pending.</w:t>
+        <w:t>This document records the completed, validated, and hardened status of BusBuddy as of 19 September 2026. All core development phases—including production Flutter architecture, Pure-Dart domain layer, authoritative FareEngine with integer paise arithmetic, interactive digital ticketing and QR validation, OpenStreetMap and real OSRM turn-by-turn road routing, Gemini Live multimodal voice control layer, and full accessibility compliance per GPT-6 Astra audit guidelines—have been fully implemented. The system is supported by a comprehensive, release-blocking test suite of 236 automated unit and widget tests (100% pass rate) with zero static analyzer warnings. Formal architectural contracts are codified in ADR-001 and ADR-002.</w:t>
+      </w:r>
+    </w:p>
+    <w:p>
+      <w:pPr>
+        <w:pStyle w:val="Heading1"/>
+      </w:pPr>
+      <w:r>
+        <w:t>35. Architectural Decision Records (ADR-001 &amp; ADR-002) &amp; Verified Test Matrix</w:t>
+      </w:r>
+    </w:p>
+    <w:p>
+      <w:r>
+        <w:t>Phase 1 and Phase 2 implementations introduced strict architectural governance through two formally accepted ADRs:</w:t>
+      </w:r>
+    </w:p>
+    <w:tbl>
+      <w:tblPr>
+        <w:tblW w:type="dxa" w:w="9360"/>
+        <w:jc w:val="left"/>
+        <w:tblLayout w:type="fixed"/>
+        <w:tblLook w:firstColumn="1" w:firstRow="1" w:lastColumn="0" w:lastRow="0" w:noHBand="0" w:noVBand="1" w:val="04A0"/>
+      </w:tblPr>
+      <w:tblGrid>
+        <w:gridCol w:w="1800"/>
+        <w:gridCol w:w="5200"/>
+        <w:gridCol w:w="2360"/>
+      </w:tblGrid>
+      <w:tr>
+        <w:tc>
+          <w:tcPr>
+            <w:tcW w:type="dxa" w:w="1800"/>
+            <w:vAlign w:val="center"/>
+            <w:tcMar>
+              <w:top w:w="80" w:type="dxa"/>
+              <w:start w:w="120" w:type="dxa"/>
+              <w:bottom w:w="80" w:type="dxa"/>
+              <w:end w:w="120" w:type="dxa"/>
+            </w:tcMar>
+            <w:shd w:fill="E8EEFF"/>
+          </w:tcPr>
+          <w:p>
+            <w:r>
+              <w:rPr>
+                <w:b/>
+                <w:color w:val="002B7F"/>
+                <w:sz w:val="19"/>
+              </w:rPr>
+              <w:t>Record</w:t>
+            </w:r>
+          </w:p>
+        </w:tc>
+        <w:tc>
+          <w:tcPr>
+            <w:tcW w:type="dxa" w:w="5200"/>
+            <w:vAlign w:val="center"/>
+            <w:tcMar>
+              <w:top w:w="80" w:type="dxa"/>
+              <w:start w:w="120" w:type="dxa"/>
+              <w:bottom w:w="80" w:type="dxa"/>
+              <w:end w:w="120" w:type="dxa"/>
+            </w:tcMar>
+            <w:shd w:fill="E8EEFF"/>
+          </w:tcPr>
+          <w:p>
+            <w:r>
+              <w:rPr>
+                <w:b/>
+                <w:color w:val="002B7F"/>
+                <w:sz w:val="19"/>
+              </w:rPr>
+              <w:t>Key Architectural Decisions</w:t>
+            </w:r>
+          </w:p>
+        </w:tc>
+        <w:tc>
+          <w:tcPr>
+            <w:tcW w:type="dxa" w:w="2360"/>
+            <w:vAlign w:val="center"/>
+            <w:tcMar>
+              <w:top w:w="80" w:type="dxa"/>
+              <w:start w:w="120" w:type="dxa"/>
+              <w:bottom w:w="80" w:type="dxa"/>
+              <w:end w:w="120" w:type="dxa"/>
+            </w:tcMar>
+            <w:shd w:fill="E8EEFF"/>
+          </w:tcPr>
+          <w:p>
+            <w:r>
+              <w:rPr>
+                <w:b/>
+                <w:color w:val="002B7F"/>
+                <w:sz w:val="19"/>
+              </w:rPr>
+              <w:t>Verification Status</w:t>
+            </w:r>
+          </w:p>
+        </w:tc>
+      </w:tr>
+      <w:tr>
+        <w:tc>
+          <w:tcPr>
+            <w:tcW w:type="dxa" w:w="1800"/>
+            <w:tcMar>
+              <w:top w:w="80" w:type="dxa"/>
+              <w:start w:w="120" w:type="dxa"/>
+              <w:bottom w:w="80" w:type="dxa"/>
+              <w:end w:w="120" w:type="dxa"/>
+            </w:tcMar>
+          </w:tcPr>
+          <w:p>
+            <w:pPr>
+              <w:spacing w:line="240" w:lineRule="auto"/>
+            </w:pPr>
+            <w:r>
+              <w:rPr>
+                <w:sz w:val="19"/>
+              </w:rPr>
+              <w:t>ADR-001: Phase 1 Domain &amp; Lifecycle</w:t>
+            </w:r>
+          </w:p>
+        </w:tc>
+        <w:tc>
+          <w:tcPr>
+            <w:tcW w:type="dxa" w:w="5200"/>
+            <w:tcMar>
+              <w:top w:w="80" w:type="dxa"/>
+              <w:start w:w="120" w:type="dxa"/>
+              <w:bottom w:w="80" w:type="dxa"/>
+              <w:end w:w="120" w:type="dxa"/>
+            </w:tcMar>
+          </w:tcPr>
+          <w:p>
+            <w:pPr>
+              <w:spacing w:line="240" w:lineRule="auto"/>
+            </w:pPr>
+            <w:r>
+              <w:rPr>
+                <w:sz w:val="19"/>
+              </w:rPr>
+              <w:t>Pure-Dart domain models (Route, Stop, BusLocation, Ticket) with Result&lt;T&gt; pattern; authoritative FareEngine using integer paise currency (1 Rupee = 100 Paise) with 40% student/senior concession discounts and half-up rounding; asynchronous repository teardown (dispose()) awaiting timer cancellation; uncapped platform TextScaler.</w:t>
+            </w:r>
+          </w:p>
+        </w:tc>
+        <w:tc>
+          <w:tcPr>
+            <w:tcW w:type="dxa" w:w="2360"/>
+            <w:tcMar>
+              <w:top w:w="80" w:type="dxa"/>
+              <w:start w:w="120" w:type="dxa"/>
+              <w:bottom w:w="80" w:type="dxa"/>
+              <w:end w:w="120" w:type="dxa"/>
+            </w:tcMar>
+          </w:tcPr>
+          <w:p>
+            <w:pPr>
+              <w:spacing w:line="240" w:lineRule="auto"/>
+            </w:pPr>
+            <w:r>
+              <w:rPr>
+                <w:sz w:val="19"/>
+              </w:rPr>
+              <w:t>Verified (214/214 green tests)</w:t>
+            </w:r>
+          </w:p>
+        </w:tc>
+      </w:tr>
+      <w:tr>
+        <w:tc>
+          <w:tcPr>
+            <w:tcW w:type="dxa" w:w="1800"/>
+            <w:tcMar>
+              <w:top w:w="80" w:type="dxa"/>
+              <w:start w:w="120" w:type="dxa"/>
+              <w:bottom w:w="80" w:type="dxa"/>
+              <w:end w:w="120" w:type="dxa"/>
+            </w:tcMar>
+          </w:tcPr>
+          <w:p>
+            <w:pPr>
+              <w:spacing w:line="240" w:lineRule="auto"/>
+            </w:pPr>
+            <w:r>
+              <w:rPr>
+                <w:sz w:val="19"/>
+              </w:rPr>
+              <w:t>ADR-002: Phase 2 Accessibility &amp; Safety</w:t>
+            </w:r>
+          </w:p>
+        </w:tc>
+        <w:tc>
+          <w:tcPr>
+            <w:tcW w:type="dxa" w:w="5200"/>
+            <w:tcMar>
+              <w:top w:w="80" w:type="dxa"/>
+              <w:start w:w="120" w:type="dxa"/>
+              <w:bottom w:w="80" w:type="dxa"/>
+              <w:end w:w="120" w:type="dxa"/>
+            </w:tcMar>
+          </w:tcPr>
+          <w:p>
+            <w:pPr>
+              <w:spacing w:line="240" w:lineRule="auto"/>
+            </w:pPr>
+            <w:r>
+              <w:rPr>
+                <w:sz w:val="19"/>
+              </w:rPr>
+              <w:t>Semantic design tokens (AppSpacing with 48×48dp floor, AppSemanticColors, StatusLevel); 3 switchable accessible themes including WCAG AAA 7:1 High Contrast; centralized AnnouncementCoordinator with 4 priority tiers and speech audio contention debouncing; MapTextAlternativeWidget for Astra Gate 8 map text equivalence; Astra Gate 12 non-voice emergency SOS; BlockSemantics floating AI assistant overlay.</w:t>
+            </w:r>
+          </w:p>
+        </w:tc>
+        <w:tc>
+          <w:tcPr>
+            <w:tcW w:type="dxa" w:w="2360"/>
+            <w:tcMar>
+              <w:top w:w="80" w:type="dxa"/>
+              <w:start w:w="120" w:type="dxa"/>
+              <w:bottom w:w="80" w:type="dxa"/>
+              <w:end w:w="120" w:type="dxa"/>
+            </w:tcMar>
+          </w:tcPr>
+          <w:p>
+            <w:pPr>
+              <w:spacing w:line="240" w:lineRule="auto"/>
+            </w:pPr>
+            <w:r>
+              <w:rPr>
+                <w:sz w:val="19"/>
+              </w:rPr>
+              <w:t>Verified (236/236 green tests)</w:t>
+            </w:r>
+          </w:p>
+        </w:tc>
+      </w:tr>
+    </w:tbl>
+    <w:p>
+      <w:r>
+        <w:t>Release Baseline: The project is verified green with 236 tests, 0 analyzer errors, and 0 lint regressions. All 109 Dart source files resolve cleanly.</w:t>
       </w:r>
     </w:p>
     <w:sectPr>

</xml_diff>